<commit_message>
Update May 19 daily note goals
</commit_message>
<xml_diff>
--- a/デイリーノート5月19日.docx
+++ b/デイリーノート5月19日.docx
@@ -5,7 +5,7 @@
     <w:p>
       <w:pPr>
         <w:rPr>
-          <w:rFonts w:ascii="游ゴシック Medium" w:eastAsia="游ゴシック Medium" w:hAnsi="游ゴシック Medium" w:hint="eastAsia"/>
+          <w:rFonts w:ascii="游ゴシック Medium" w:eastAsia="游ゴシック Medium" w:hAnsi="游ゴシック Medium"/>
           <w:sz w:val="28"/>
         </w:rPr>
       </w:pPr>
@@ -281,7 +281,7 @@
           <w:p>
             <w:pPr>
               <w:rPr>
-                <w:rFonts w:ascii="游ゴシック Medium" w:eastAsia="游ゴシック Medium" w:hAnsi="游ゴシック Medium" w:hint="eastAsia"/>
+                <w:rFonts w:ascii="游ゴシック Medium" w:eastAsia="游ゴシック Medium" w:hAnsi="游ゴシック Medium"/>
                 <w:sz w:val="18"/>
                 <w:szCs w:val="18"/>
               </w:rPr>
@@ -290,7 +290,7 @@
           <w:p>
             <w:pPr>
               <w:rPr>
-                <w:rFonts w:ascii="游ゴシック Medium" w:eastAsia="游ゴシック Medium" w:hAnsi="游ゴシック Medium" w:hint="eastAsia"/>
+                <w:rFonts w:ascii="游ゴシック Medium" w:eastAsia="游ゴシック Medium" w:hAnsi="游ゴシック Medium"/>
                 <w:sz w:val="18"/>
                 <w:szCs w:val="18"/>
               </w:rPr>
@@ -815,37 +815,43 @@
           <w:p>
             <w:pPr>
               <w:rPr>
-                <w:rFonts w:ascii="游ゴシック Medium" w:eastAsia="游ゴシック Medium" w:hAnsi="游ゴシック Medium"/>
-              </w:rPr>
-            </w:pPr>
-          </w:p>
-          <w:p>
-            <w:pPr>
-              <w:rPr>
-                <w:rFonts w:ascii="游ゴシック Medium" w:eastAsia="游ゴシック Medium" w:hAnsi="游ゴシック Medium"/>
-              </w:rPr>
-            </w:pPr>
-            <w:r>
-              <w:rPr>
-                <w:rFonts w:ascii="游ゴシック Medium" w:eastAsia="游ゴシック Medium" w:hAnsi="游ゴシック Medium" w:hint="eastAsia"/>
+                <w:rFonts w:asciiTheme="minorEastAsia" w:hAnsiTheme="minorEastAsia"/>
+                <w:szCs w:val="21"/>
+              </w:rPr>
+            </w:pPr>
+          </w:p>
+          <w:p>
+            <w:pPr>
+              <w:rPr>
+                <w:rFonts w:asciiTheme="minorEastAsia" w:hAnsiTheme="minorEastAsia"/>
+                <w:szCs w:val="21"/>
+              </w:rPr>
+            </w:pPr>
+            <w:r>
+              <w:rPr>
+                <w:rFonts w:asciiTheme="minorEastAsia" w:hAnsiTheme="minorEastAsia" w:hint="eastAsia"/>
+                <w:szCs w:val="21"/>
               </w:rPr>
               <w:t>情報収集</w:t>
             </w:r>
             <w:r>
               <w:rPr>
-                <w:rFonts w:ascii="游ゴシック Medium" w:eastAsia="游ゴシック Medium" w:hAnsi="游ゴシック Medium"/>
+                <w:rFonts w:asciiTheme="minorEastAsia" w:hAnsiTheme="minorEastAsia"/>
+                <w:szCs w:val="21"/>
               </w:rPr>
               <w:t xml:space="preserve"> </w:t>
             </w:r>
             <w:r>
               <w:rPr>
-                <w:rFonts w:ascii="游ゴシック Medium" w:eastAsia="游ゴシック Medium" w:hAnsi="游ゴシック Medium" w:hint="eastAsia"/>
+                <w:rFonts w:asciiTheme="minorEastAsia" w:hAnsiTheme="minorEastAsia" w:hint="eastAsia"/>
+                <w:szCs w:val="21"/>
               </w:rPr>
               <w:t>自宅退院</w:t>
             </w:r>
             <w:r>
               <w:rPr>
-                <w:rFonts w:ascii="游ゴシック Medium" w:eastAsia="游ゴシック Medium" w:hAnsi="游ゴシック Medium"/>
+                <w:rFonts w:asciiTheme="minorEastAsia" w:hAnsiTheme="minorEastAsia"/>
+                <w:szCs w:val="21"/>
               </w:rPr>
               <w:t>希望</w:t>
             </w:r>
@@ -853,19 +859,74 @@
           <w:p>
             <w:pPr>
               <w:rPr>
-                <w:rFonts w:ascii="游ゴシック Medium" w:eastAsia="游ゴシック Medium" w:hAnsi="游ゴシック Medium" w:hint="eastAsia"/>
-              </w:rPr>
-            </w:pPr>
-          </w:p>
-          <w:p>
-            <w:pPr>
-              <w:rPr>
-                <w:rFonts w:ascii="游ゴシック Medium" w:eastAsia="游ゴシック Medium" w:hAnsi="游ゴシック Medium"/>
-              </w:rPr>
-            </w:pPr>
-            <w:r>
-              <w:rPr>
-                <w:rFonts w:ascii="游ゴシック Medium" w:eastAsia="游ゴシック Medium" w:hAnsi="游ゴシック Medium" w:hint="eastAsia"/>
+                <w:rFonts w:asciiTheme="minorEastAsia" w:hAnsiTheme="minorEastAsia"/>
+                <w:szCs w:val="21"/>
+              </w:rPr>
+            </w:pPr>
+          </w:p>
+          <w:p>
+            <w:pPr>
+              <w:rPr>
+                <w:rFonts w:asciiTheme="minorEastAsia" w:hAnsiTheme="minorEastAsia"/>
+                <w:szCs w:val="21"/>
+              </w:rPr>
+            </w:pPr>
+            <w:r>
+              <w:rPr>
+                <w:rFonts w:asciiTheme="minorEastAsia" w:hAnsiTheme="minorEastAsia" w:hint="eastAsia"/>
+                <w:szCs w:val="21"/>
+              </w:rPr>
+              <w:t xml:space="preserve">動作観察　</w:t>
+            </w:r>
+          </w:p>
+          <w:p>
+            <w:pPr>
+              <w:rPr>
+                <w:rFonts w:asciiTheme="minorEastAsia" w:hAnsiTheme="minorEastAsia"/>
+                <w:szCs w:val="21"/>
+              </w:rPr>
+            </w:pPr>
+            <w:r>
+              <w:rPr>
+                <w:rFonts w:asciiTheme="minorEastAsia" w:hAnsiTheme="minorEastAsia" w:hint="eastAsia"/>
+                <w:szCs w:val="21"/>
+              </w:rPr>
+              <w:t>歩行時にデュシェンヌ徴候</w:t>
+            </w:r>
+            <w:r>
+              <w:rPr>
+                <w:rFonts w:asciiTheme="minorEastAsia" w:hAnsiTheme="minorEastAsia" w:hint="eastAsia"/>
+                <w:szCs w:val="21"/>
+              </w:rPr>
+              <w:t>の</w:t>
+            </w:r>
+            <w:r>
+              <w:rPr>
+                <w:rFonts w:asciiTheme="minorEastAsia" w:hAnsiTheme="minorEastAsia"/>
+                <w:szCs w:val="21"/>
+              </w:rPr>
+              <w:t>ような、立脚側に体幹が傾くような動きが見られた。</w:t>
+            </w:r>
+          </w:p>
+          <w:p>
+            <w:pPr>
+              <w:rPr>
+                <w:rFonts w:asciiTheme="minorEastAsia" w:hAnsiTheme="minorEastAsia" w:hint="eastAsia"/>
+                <w:szCs w:val="21"/>
+              </w:rPr>
+            </w:pPr>
+          </w:p>
+          <w:p>
+            <w:pPr>
+              <w:rPr>
+                <w:rFonts w:asciiTheme="minorEastAsia" w:hAnsiTheme="minorEastAsia"/>
+                <w:szCs w:val="21"/>
+              </w:rPr>
+            </w:pPr>
+            <w:r>
+              <w:rPr>
+                <w:rFonts w:asciiTheme="minorEastAsia" w:hAnsiTheme="minorEastAsia" w:hint="eastAsia"/>
+                <w:szCs w:val="21"/>
               </w:rPr>
               <w:t>統合と解釈</w:t>
             </w:r>
@@ -873,82 +934,33 @@
           <w:p>
             <w:pPr>
               <w:rPr>
-                <w:rFonts w:ascii="游ゴシック Medium" w:eastAsia="游ゴシック Medium" w:hAnsi="游ゴシック Medium" w:hint="eastAsia"/>
-              </w:rPr>
-            </w:pPr>
-            <w:r>
-              <w:rPr>
-                <w:rFonts w:ascii="游ゴシック Medium" w:eastAsia="游ゴシック Medium" w:hAnsi="游ゴシック Medium"/>
-              </w:rPr>
-              <w:t>股関節内転ROMエクササイズ時に</w:t>
-            </w:r>
-            <w:r>
-              <w:rPr>
-                <w:rFonts w:ascii="游ゴシック Medium" w:eastAsia="游ゴシック Medium" w:hAnsi="游ゴシック Medium"/>
-              </w:rPr>
-              <w:t>右中殿筋の短縮</w:t>
-            </w:r>
-            <w:r>
-              <w:rPr>
-                <w:rFonts w:ascii="游ゴシック Medium" w:eastAsia="游ゴシック Medium" w:hAnsi="游ゴシック Medium" w:hint="eastAsia"/>
-              </w:rPr>
-              <w:t>が</w:t>
-            </w:r>
-            <w:r>
-              <w:rPr>
-                <w:rFonts w:ascii="游ゴシック Medium" w:eastAsia="游ゴシック Medium" w:hAnsi="游ゴシック Medium"/>
-              </w:rPr>
-              <w:t>確認</w:t>
-            </w:r>
-            <w:r>
-              <w:rPr>
-                <w:rFonts w:ascii="游ゴシック Medium" w:eastAsia="游ゴシック Medium" w:hAnsi="游ゴシック Medium" w:hint="eastAsia"/>
-              </w:rPr>
-              <w:t>された。</w:t>
-            </w:r>
-          </w:p>
-          <w:p>
-            <w:pPr>
-              <w:rPr>
-                <w:rFonts w:ascii="游ゴシック Medium" w:eastAsia="游ゴシック Medium" w:hAnsi="游ゴシック Medium"/>
-              </w:rPr>
-            </w:pPr>
-          </w:p>
-          <w:p>
-            <w:pPr>
-              <w:rPr>
-                <w:rFonts w:ascii="游ゴシック Medium" w:eastAsia="游ゴシック Medium" w:hAnsi="游ゴシック Medium"/>
-              </w:rPr>
-            </w:pPr>
-            <w:r>
-              <w:rPr>
-                <w:rFonts w:ascii="游ゴシック Medium" w:eastAsia="游ゴシック Medium" w:hAnsi="游ゴシック Medium" w:hint="eastAsia"/>
-              </w:rPr>
-              <w:t>問題点の抽出</w:t>
-            </w:r>
-          </w:p>
-          <w:p>
-            <w:pPr>
-              <w:rPr>
-                <w:rFonts w:ascii="游ゴシック Medium" w:eastAsia="游ゴシック Medium" w:hAnsi="游ゴシック Medium"/>
-              </w:rPr>
-            </w:pPr>
-            <w:r>
-              <w:rPr>
-                <w:sz w:val="18"/>
-              </w:rPr>
-              <w:t>右中殿筋の短縮により、右股関節内転方向の可動域制限がみられる。そのため、股関節を内転させる際に骨盤や体幹で代償しやすく、立位や歩行時の荷重移動にも影響する可能性がある。</w:t>
-            </w:r>
-          </w:p>
-          <w:p>
-            <w:pPr>
-              <w:rPr>
-                <w:rFonts w:ascii="游ゴシック Medium" w:eastAsia="游ゴシック Medium" w:hAnsi="游ゴシック Medium"/>
-              </w:rPr>
-            </w:pPr>
-            <w:r>
-              <w:rPr>
-                <w:rFonts w:ascii="游ゴシック Medium" w:eastAsia="游ゴシック Medium" w:hAnsi="游ゴシック Medium" w:hint="eastAsia"/>
+                <w:rFonts w:asciiTheme="minorEastAsia" w:hAnsiTheme="minorEastAsia"/>
+                <w:szCs w:val="21"/>
+              </w:rPr>
+            </w:pPr>
+            <w:r>
+              <w:t>診断名はアテローム血栓性脳梗塞で、2型糖尿病もある。歩行では立脚側へ体幹が傾くデュシェンヌ徴候様の動きがみられ、立脚期に下肢で体重を支える力や股関節周囲の安定性、バランスの低下が関係していると考えられる。股関節・膝関節・足関節のROMexを実施していることから、下肢の可動性を保ち、骨盤や体幹の代償を少なくすることが、安定した荷重と歩行につながると考えた。本人は自宅退院を希望しているため、活動面では安全に歩けることが重要であり、残存している歩行能力を活かしながら、立位・歩行時の左右差を減らしていく必要がある。</w:t>
+            </w:r>
+          </w:p>
+          <w:p>
+            <w:pPr>
+              <w:rPr>
+                <w:rFonts w:asciiTheme="minorEastAsia" w:hAnsiTheme="minorEastAsia"/>
+                <w:szCs w:val="21"/>
+              </w:rPr>
+            </w:pPr>
+          </w:p>
+          <w:p>
+            <w:pPr>
+              <w:rPr>
+                <w:rFonts w:asciiTheme="minorEastAsia" w:hAnsiTheme="minorEastAsia"/>
+                <w:szCs w:val="21"/>
+              </w:rPr>
+            </w:pPr>
+            <w:r>
+              <w:rPr>
+                <w:rFonts w:asciiTheme="minorEastAsia" w:hAnsiTheme="minorEastAsia" w:hint="eastAsia"/>
+                <w:szCs w:val="21"/>
               </w:rPr>
               <w:t>目標設定</w:t>
             </w:r>
@@ -956,25 +968,25 @@
           <w:p>
             <w:pPr>
               <w:rPr>
-                <w:rFonts w:ascii="游ゴシック Medium" w:eastAsia="游ゴシック Medium" w:hAnsi="游ゴシック Medium"/>
-              </w:rPr>
-            </w:pPr>
-            <w:r>
-              <w:rPr>
-                <w:sz w:val="18"/>
-              </w:rPr>
-              <w:t>短期目標は、ROMエクササイズ時に骨盤の代償を抑えながら右股関節内転可動域を改善することである。長期目標は、右股関節周囲の柔軟性を保ち、立位や歩行時に左右差の少ない荷重移動が行えるようにすることである。</w:t>
-            </w:r>
-          </w:p>
-          <w:p>
-            <w:pPr>
-              <w:rPr>
-                <w:rFonts w:ascii="游ゴシック Medium" w:eastAsia="游ゴシック Medium" w:hAnsi="游ゴシック Medium"/>
-              </w:rPr>
-            </w:pPr>
-            <w:r>
-              <w:rPr>
-                <w:rFonts w:ascii="游ゴシック Medium" w:eastAsia="游ゴシック Medium" w:hAnsi="游ゴシック Medium"/>
+                <w:rFonts w:asciiTheme="minorEastAsia" w:hAnsiTheme="minorEastAsia"/>
+                <w:szCs w:val="21"/>
+              </w:rPr>
+            </w:pPr>
+            <w:r>
+              <w:t>短期目標は、ROMエクササイズ時に骨盤や体幹の代償を抑えながら、股関節・膝関節・足関節の可動性を保ち、立位で左右へ安定して荷重できるようにすることである。長期目標は、自宅退院に向けて、歩行時の立脚側への体幹傾斜を軽減し、ふらつきの少ない歩行と左右差の少ない荷重移動が行えるようにすることである。</w:t>
+            </w:r>
+          </w:p>
+          <w:p>
+            <w:pPr>
+              <w:rPr>
+                <w:rFonts w:asciiTheme="minorEastAsia" w:hAnsiTheme="minorEastAsia"/>
+                <w:szCs w:val="21"/>
+              </w:rPr>
+            </w:pPr>
+            <w:r>
+              <w:rPr>
+                <w:rFonts w:asciiTheme="minorEastAsia" w:hAnsiTheme="minorEastAsia"/>
+                <w:szCs w:val="21"/>
               </w:rPr>
               <w:t>プログラム立案</w:t>
             </w:r>
@@ -982,19 +994,22 @@
           <w:p>
             <w:pPr>
               <w:rPr>
-                <w:rFonts w:ascii="游ゴシック Medium" w:eastAsia="游ゴシック Medium" w:hAnsi="游ゴシック Medium"/>
-              </w:rPr>
-            </w:pPr>
-          </w:p>
-          <w:p>
-            <w:pPr>
-              <w:rPr>
-                <w:rFonts w:ascii="游ゴシック Medium" w:eastAsia="游ゴシック Medium" w:hAnsi="游ゴシック Medium"/>
-              </w:rPr>
-            </w:pPr>
-            <w:r>
-              <w:rPr>
-                <w:rFonts w:ascii="游ゴシック Medium" w:eastAsia="游ゴシック Medium" w:hAnsi="游ゴシック Medium"/>
+                <w:rFonts w:asciiTheme="minorEastAsia" w:hAnsiTheme="minorEastAsia"/>
+                <w:szCs w:val="21"/>
+              </w:rPr>
+            </w:pPr>
+          </w:p>
+          <w:p>
+            <w:pPr>
+              <w:rPr>
+                <w:rFonts w:asciiTheme="minorEastAsia" w:hAnsiTheme="minorEastAsia"/>
+                <w:szCs w:val="21"/>
+              </w:rPr>
+            </w:pPr>
+            <w:r>
+              <w:rPr>
+                <w:rFonts w:asciiTheme="minorEastAsia" w:hAnsiTheme="minorEastAsia"/>
+                <w:szCs w:val="21"/>
               </w:rPr>
               <w:t>プログラム実施</w:t>
             </w:r>
@@ -1002,19 +1017,22 @@
           <w:p>
             <w:pPr>
               <w:rPr>
-                <w:rFonts w:ascii="游ゴシック Medium" w:eastAsia="游ゴシック Medium" w:hAnsi="游ゴシック Medium"/>
-              </w:rPr>
-            </w:pPr>
-          </w:p>
-          <w:p>
-            <w:pPr>
-              <w:rPr>
-                <w:rFonts w:ascii="游ゴシック Medium" w:eastAsia="游ゴシック Medium" w:hAnsi="游ゴシック Medium"/>
-              </w:rPr>
-            </w:pPr>
-            <w:r>
-              <w:rPr>
-                <w:rFonts w:ascii="游ゴシック Medium" w:eastAsia="游ゴシック Medium" w:hAnsi="游ゴシック Medium"/>
+                <w:rFonts w:asciiTheme="minorEastAsia" w:hAnsiTheme="minorEastAsia"/>
+                <w:szCs w:val="21"/>
+              </w:rPr>
+            </w:pPr>
+          </w:p>
+          <w:p>
+            <w:pPr>
+              <w:rPr>
+                <w:rFonts w:asciiTheme="minorEastAsia" w:hAnsiTheme="minorEastAsia"/>
+                <w:szCs w:val="21"/>
+              </w:rPr>
+            </w:pPr>
+            <w:r>
+              <w:rPr>
+                <w:rFonts w:asciiTheme="minorEastAsia" w:hAnsiTheme="minorEastAsia"/>
+                <w:szCs w:val="21"/>
               </w:rPr>
               <w:t>再評価</w:t>
             </w:r>
@@ -1057,7 +1075,7 @@
           <w:p>
             <w:pPr>
               <w:rPr>
-                <w:rFonts w:ascii="游ゴシック Medium" w:eastAsia="游ゴシック Medium" w:hAnsi="游ゴシック Medium" w:hint="eastAsia"/>
+                <w:rFonts w:ascii="游ゴシック Medium" w:eastAsia="游ゴシック Medium" w:hAnsi="游ゴシック Medium"/>
               </w:rPr>
             </w:pPr>
           </w:p>
@@ -1141,7 +1159,7 @@
           <w:p>
             <w:pPr>
               <w:rPr>
-                <w:rFonts w:ascii="游ゴシック Medium" w:eastAsia="游ゴシック Medium" w:hAnsi="游ゴシック Medium" w:hint="eastAsia"/>
+                <w:rFonts w:ascii="游ゴシック Medium" w:eastAsia="游ゴシック Medium" w:hAnsi="游ゴシック Medium"/>
               </w:rPr>
             </w:pPr>
           </w:p>
@@ -1218,7 +1236,7 @@
           <w:p>
             <w:pPr>
               <w:rPr>
-                <w:rFonts w:ascii="游ゴシック Medium" w:eastAsia="游ゴシック Medium" w:hAnsi="游ゴシック Medium" w:hint="eastAsia"/>
+                <w:rFonts w:ascii="游ゴシック Medium" w:eastAsia="游ゴシック Medium" w:hAnsi="游ゴシック Medium"/>
               </w:rPr>
             </w:pPr>
           </w:p>
@@ -1251,6 +1269,7 @@
                 <w:rFonts w:ascii="游ゴシック Medium" w:eastAsia="游ゴシック Medium" w:hAnsi="游ゴシック Medium" w:hint="eastAsia"/>
                 <w:szCs w:val="21"/>
               </w:rPr>
+              <w:lastRenderedPageBreak/>
               <w:t>【感　想・反　省】</w:t>
             </w:r>
           </w:p>
@@ -1311,7 +1330,7 @@
       <w:pPr>
         <w:ind w:right="824" w:firstLineChars="100" w:firstLine="210"/>
         <w:rPr>
-          <w:rFonts w:ascii="游ゴシック Medium" w:eastAsia="游ゴシック Medium" w:hAnsi="游ゴシック Medium" w:hint="eastAsia"/>
+          <w:rFonts w:ascii="游ゴシック Medium" w:eastAsia="游ゴシック Medium" w:hAnsi="游ゴシック Medium"/>
           <w:bCs/>
         </w:rPr>
       </w:pPr>

</xml_diff>

<commit_message>
Revise May 19 integration notes
</commit_message>
<xml_diff>
--- a/デイリーノート5月19日.docx
+++ b/デイリーノート5月19日.docx
@@ -911,44 +911,36 @@
           <w:p>
             <w:pPr>
               <w:rPr>
+                <w:rFonts w:asciiTheme="minorEastAsia" w:hAnsiTheme="minorEastAsia"/>
+                <w:szCs w:val="21"/>
+              </w:rPr>
+            </w:pPr>
+          </w:p>
+          <w:p>
+            <w:pPr>
+              <w:rPr>
+                <w:rFonts w:asciiTheme="minorEastAsia" w:hAnsiTheme="minorEastAsia"/>
+                <w:szCs w:val="21"/>
+              </w:rPr>
+            </w:pPr>
+            <w:r>
+              <w:rPr>
                 <w:rFonts w:asciiTheme="minorEastAsia" w:hAnsiTheme="minorEastAsia" w:hint="eastAsia"/>
                 <w:szCs w:val="21"/>
               </w:rPr>
-            </w:pPr>
-          </w:p>
-          <w:p>
-            <w:pPr>
-              <w:rPr>
-                <w:rFonts w:asciiTheme="minorEastAsia" w:hAnsiTheme="minorEastAsia"/>
-                <w:szCs w:val="21"/>
-              </w:rPr>
-            </w:pPr>
-            <w:r>
+              <w:t>統合と解釈</w:t>
+            </w:r>
+          </w:p>
+          <w:p>
+            <w:pPr>
               <w:rPr>
                 <w:rFonts w:asciiTheme="minorEastAsia" w:hAnsiTheme="minorEastAsia" w:hint="eastAsia"/>
                 <w:szCs w:val="21"/>
               </w:rPr>
-              <w:t>統合と解釈</w:t>
-            </w:r>
-          </w:p>
-          <w:p>
-            <w:pPr>
-              <w:rPr>
-                <w:rFonts w:asciiTheme="minorEastAsia" w:hAnsiTheme="minorEastAsia"/>
-                <w:szCs w:val="21"/>
-              </w:rPr>
-            </w:pPr>
-            <w:r>
-              <w:t>診断名はアテローム血栓性脳梗塞で、2型糖尿病もある。歩行では立脚側へ体幹が傾くデュシェンヌ徴候様の動きがみられ、立脚期に下肢で体重を支える力や股関節周囲の安定性、バランスの低下が関係していると考えられる。股関節・膝関節・足関節のROMexを実施していることから、下肢の可動性を保ち、骨盤や体幹の代償を少なくすることが、安定した荷重と歩行につながると考えた。本人は自宅退院を希望しているため、活動面では安全に歩けることが重要であり、残存している歩行能力を活かしながら、立位・歩行時の左右差を減らしていく必要がある。</w:t>
-            </w:r>
-          </w:p>
-          <w:p>
-            <w:pPr>
-              <w:rPr>
-                <w:rFonts w:asciiTheme="minorEastAsia" w:hAnsiTheme="minorEastAsia"/>
-                <w:szCs w:val="21"/>
-              </w:rPr>
-            </w:pPr>
+            </w:pPr>
+            <w:r>
+              <w:t>歩行時にはデュシェンヌ徴候様に、立脚側へ体幹が傾く動きがみられた。また、股関節では中殿筋の短縮がみられ、股関節内転方向の動きが出にくく、骨盤や体幹で代償している可能性があると考えた。股関節・膝関節・足関節のROMexを行うことで、下肢の可動性を保ち、立位や歩行時に骨盤の動きと荷重移動が行いやすくなるようにしていく必要がある。本人は自宅退院を希望しているため、残存している歩行能力を活かしながら、体幹の過度な傾きや左右差を減らし、安全に歩行できることが大切である。</w:t>
+            </w:r>
           </w:p>
           <w:p>
             <w:pPr>

</xml_diff>